<commit_message>
fix: validate model runtime and correct practice docs
</commit_message>
<xml_diff>
--- a/docs/report/prediploma-practice/НМГоровенко_ПреддипломнаяПрактика_ПромежуточныйОтчет2.docx
+++ b/docs/report/prediploma-practice/НМГоровенко_ПреддипломнаяПрактика_ПромежуточныйОтчет2.docx
@@ -2753,7 +2753,7 @@
         <w:jc w:val="both"/>
       </w:pPr>
       <w:r>
-        <w:t>Промежуточный отчет №2 отражает результаты разработки продуктового контура uav-simulator за этапы Спринт 1, Спринт 2 и Спринт 3 преддипломной практики.</w:t>
+        <w:t>Промежуточный отчет №2 фиксирует состояние преддипломной практики на этапе доведения uav-simulator до контура train -&gt; install -&gt; run для сценария A-&gt;B.</w:t>
       </w:r>
     </w:p>
     <w:p>
@@ -2761,7 +2761,7 @@
         <w:jc w:val="both"/>
       </w:pPr>
       <w:r>
-        <w:t>Фокус этапа: доведение платформы до практического контура train -&gt; install -&gt; run для сценария A-&gt;B с единым web-ui и backend для unity-sim и real-robot режимов.</w:t>
+        <w:t>В продуктовую рамку включены четыре части: web-ui оператора, CLI rusim, Unity-симулятор с API и plugin architecture, а также Python-код обучения модели.</w:t>
       </w:r>
     </w:p>
     <w:p>
@@ -2777,7 +2777,7 @@
         <w:jc w:val="both"/>
       </w:pPr>
       <w:r>
-        <w:t>В рамках этапа выполнены работы по продуктовой декомпозиции, развитию backend/web-ui для управления моделями, подготовке training artifact pipeline и запуску автопилотного контура.</w:t>
+        <w:t>В рамках этапа выполнены работы по декомпозиции продукта, фиксации границ между web-ui, rusim, Unity runtime и Python training pipeline, а также по подготовке model lifecycle и API-контуров.</w:t>
       </w:r>
     </w:p>
     <w:p>
@@ -2793,7 +2793,7 @@
         <w:jc w:val="both"/>
       </w:pPr>
       <w:r>
-        <w:t>Зафиксированы границы продуктового слоя, включая CLI rusim, CI/CD, runtime API, plugin architecture и operator stack.</w:t>
+        <w:t>Зафиксированы четыре основные части проекта: web-ui для подключения и управления, CLI rusim для установки runtime и плагинов, Unity-симулятор с HTTP/REST, ROS2 и ML-Agents, Python-контур обучения модели.</w:t>
       </w:r>
     </w:p>
     <w:p>
@@ -2825,7 +2825,7 @@
         <w:jc w:val="both"/>
       </w:pPr>
       <w:r>
-        <w:t>Добавлены endpoint-ы для upload/list/activate/active и контур autopilot start/stop/status.</w:t>
+        <w:t>Добавлены endpoint-ы для upload/list/activate/active и контур autopilot start/stop/status со scoped-статусом по clientId/runtimeMode.</w:t>
       </w:r>
     </w:p>
     <w:p>
@@ -2833,7 +2833,7 @@
         <w:jc w:val="both"/>
       </w:pPr>
       <w:r>
-        <w:t>В web-ui добавлен раздел Model Control для загрузки артефакта, активации модели и запуска автопилота.</w:t>
+        <w:t>В web-ui добавлен раздел Model Control для загрузки артефакта, активации модели и запуска автопилота без смешения состояний разных runtime.</w:t>
       </w:r>
     </w:p>
     <w:p>
@@ -2849,7 +2849,7 @@
         <w:jc w:val="both"/>
       </w:pPr>
       <w:r>
-        <w:t>Подготовлен базовый training pipeline для генерации ONNX-артефакта и метаданных политики.</w:t>
+        <w:t>Подготовлен базовый training pipeline для генерации ONNX-артефакта и метаданных политики, совместимых с backend runtime.</w:t>
       </w:r>
     </w:p>
     <w:p>
@@ -2865,7 +2865,7 @@
         <w:jc w:val="both"/>
       </w:pPr>
       <w:r>
-        <w:t>Контур train/install/run валидирован на симуляторе как база для sim-to-real этапа.</w:t>
+        <w:t>Подтверждена базовая работоспособность контрактов train/upload/install на уровне backend и API smoke; полноценная серия эпизодов в симуляторе и на реальной машинке остается отдельным этапом.</w:t>
       </w:r>
     </w:p>
     <w:p>
@@ -2881,7 +2881,7 @@
         <w:jc w:val="both"/>
       </w:pPr>
       <w:r>
-        <w:t>Сформированы журналы изменений спринтов и набор метрик для оценки устойчивости автопилотного режима.</w:t>
+        <w:t>Сформированы журналы изменений спринтов, критерии приемки и набор метрик для последующего sim-to-real этапа.</w:t>
       </w:r>
     </w:p>
     <w:p>
@@ -2889,7 +2889,7 @@
         <w:jc w:val="both"/>
       </w:pPr>
       <w:r>
-        <w:t>Ограничения этапа: baseline-политика и необходимость расширения набора реальных прогонов для статистически устойчивой оценки.</w:t>
+        <w:t>Ограничения этапа: реальные прогоны на машинке в данный период не завершены, поэтому выводы ограничены подготовкой инфраструктуры и проверкой контрактов.</w:t>
       </w:r>
     </w:p>
     <w:p>
@@ -2906,7 +2906,7 @@
         <w:jc w:val="both"/>
       </w:pPr>
       <w:r>
-        <w:t>По итогам этапа сформирован практический контур train/install/run и подготовлена база для финального отчета и защиты.</w:t>
+        <w:t>По итогам этапа сформирована инфраструктурная база для контура train/install/run и подготовлена база для последующего экспериментального этапа.</w:t>
       </w:r>
     </w:p>
     <w:p>

</xml_diff>